<commit_message>
Apply D-020 to every document: mean = mean (rata-rata), median = valor klaran
The glossary JSON/CSV were corrected when D-020 was accepted, but the documents
built from them were not rebuilt, so the hub still shipped the banned term
"media" for mean - in FS2, the sheet whose whole purpose is that distinction,
and in the English-Tetum glossary itself.

Rebuilt FS1-FS9, the activity worksheets and card packs, and the glossary
document from the locked terminology, and re-exported all 15 PDFs.

The glossary document is now the reviewed one generated from
tetum-glossary.csv. It replaces an older hand-maintained version that carried
its own hard-coded term list and a "have a colleague check this" warning that
no longer applies - the terms have been through two rounds of native-speaker
review.
</commit_message>
<xml_diff>
--- a/docs/m3/data-analysis-intro/files/FS2_Mean-or-Median.docx
+++ b/docs/m3/data-analysis-intro/files/FS2_Mean-or-Median.docx
@@ -2091,7 +2091,7 @@
                       <w:color w:val="0F7B7B"/>
                       <w:sz w:val="19"/>
                     </w:rPr>
-                    <w:t>Média</w:t>
+                    <w:t>mean (rata-rata)</w:t>
                   </w:r>
                 </w:p>
               </w:tc>
@@ -2141,7 +2141,7 @@
                       <w:color w:val="0F7B7B"/>
                       <w:sz w:val="19"/>
                     </w:rPr>
-                    <w:t>Valór klaran</w:t>
+                    <w:t>valór klaran</w:t>
                   </w:r>
                 </w:p>
               </w:tc>

</xml_diff>